<commit_message>
Update manuals, sync folders, and prepare Vercel deploy
</commit_message>
<xml_diff>
--- a/final implemantation of accounting and billing/Frontend_UI_UX_Spec_For_Claude.docx
+++ b/final implemantation of accounting and billing/Frontend_UI_UX_Spec_For_Claude.docx
@@ -206,6 +206,102 @@
     <w:p>
       <w:r>
         <w:t>- Bottom: 2 Columns containing 'Global Stats' and 'System Alerts'. NO Bulletin Board.</w:t>
+      </w:r>
+    </w:p>
+    <w:p>
+      <w:pPr>
+        <w:pStyle w:val="Heading2"/>
+      </w:pPr>
+      <w:r>
+        <w:t>Update: Geographic Map Implementation Rules (V4)</w:t>
+      </w:r>
+    </w:p>
+    <w:p>
+      <w:r>
+        <w:rPr>
+          <w:b/>
+        </w:rPr>
+        <w:t>The GeographicMap component in the Admin Dashboard has been completely overhauled and rolled back to use react-leaflet based on specific executive requirements.</w:t>
+      </w:r>
+    </w:p>
+    <w:p>
+      <w:pPr>
+        <w:pStyle w:val="ListNumber"/>
+      </w:pPr>
+      <w:r>
+        <w:t>1. Grid Integration:</w:t>
+      </w:r>
+    </w:p>
+    <w:p>
+      <w:pPr>
+        <w:pStyle w:val="ListBullet"/>
+      </w:pPr>
+      <w:r>
+        <w:t>The Map MUST span exactly one row (340px) to form a perfectly uniform 3x2 grid layout alongside the Recharts widgets.</w:t>
+      </w:r>
+    </w:p>
+    <w:p>
+      <w:pPr>
+        <w:pStyle w:val="ListNumber"/>
+      </w:pPr>
+      <w:r>
+        <w:t>2. Leaflet Dependency:</w:t>
+      </w:r>
+    </w:p>
+    <w:p>
+      <w:pPr>
+        <w:pStyle w:val="ListBullet"/>
+      </w:pPr>
+      <w:r>
+        <w:t>The component MUST use react-leaflet with a CartoDB Dark map tile layer (https://{s}.basemaps.cartocdn.com/dark_all/{z}/{x}/{y}{r}.png).</w:t>
+      </w:r>
+    </w:p>
+    <w:p>
+      <w:pPr>
+        <w:pStyle w:val="ListNumber"/>
+      </w:pPr>
+      <w:r>
+        <w:t>3. GeoJSON Territories:</w:t>
+      </w:r>
+    </w:p>
+    <w:p>
+      <w:pPr>
+        <w:pStyle w:val="ListBullet"/>
+      </w:pPr>
+      <w:r>
+        <w:t>The map MUST dynamically fetch India GeoJSON data and strictly filter it to display ONLY the boundaries of the active territories where the user has supplies (Maharashtra, Delhi, Karnataka). It must NOT display boundaries for the rest of India.</w:t>
+      </w:r>
+    </w:p>
+    <w:p>
+      <w:pPr>
+        <w:pStyle w:val="ListNumber"/>
+      </w:pPr>
+      <w:r>
+        <w:t>4. Pulsating Markers:</w:t>
+      </w:r>
+    </w:p>
+    <w:p>
+      <w:pPr>
+        <w:pStyle w:val="ListBullet"/>
+      </w:pPr>
+      <w:r>
+        <w:t>City markers MUST use custom CSS animated glowing/pulsating blue dots. Do not use static teardrop pins.</w:t>
+      </w:r>
+    </w:p>
+    <w:p>
+      <w:pPr>
+        <w:pStyle w:val="ListNumber"/>
+      </w:pPr>
+      <w:r>
+        <w:t>5. Dynamic Zoom Interaction:</w:t>
+      </w:r>
+    </w:p>
+    <w:p>
+      <w:pPr>
+        <w:pStyle w:val="ListBullet"/>
+      </w:pPr>
+      <w:r>
+        <w:t>City names (labels) MUST only be revealed dynamically as the user zooms in and expands the territory. At zoom level 1, only the pulsating dots should be visible. At zoom level &gt; 2, the city names should appear.</w:t>
       </w:r>
     </w:p>
     <w:sectPr>

</xml_diff>